<commit_message>
chore(demo): recaptura de los fixtures de la demo con la 1.16.0 (OK de Cami del 2026-09-15)
Capturados en Linux por recapture-demo.yml (run 34974936017) sobre el bump 104226e con árbol limpio: results-*.json con nikodym == 1.16.0, git_sha del bump y git_dirty == false; la validación trae las claves de las capas A/B/C (green_alpha/red_alpha/not_evaluable_reason, traffic_light_cuts, not_evaluable_partitions, min_rows_per_group, stability_source, stability_recompute) y el informe F1 ya pinta rótulos en las tablas de validación (ningún identificador crudo en el cuerpo). Firmas regeneradas; los run_id que deploy.yml busca en vivo pasan a 40cdcfc9… (F1) y 2defa63d… (F4); check_demo_report_copy.py y check:demo-bundle en verde. DEMO_GOVERNANCE y el propósito de la demo no cambian.

Co-Authored-By: Claude Opus 5 <noreply@anthropic.com>
</commit_message>
<xml_diff>
--- a/web/src/fixtures/demo/report-f1.docx
+++ b/web/src/fixtures/demo/report-f1.docx
@@ -163,7 +163,7 @@
           </w:tcPr>
           <w:p>
             <w:r>
-              <w:t>2026-09-12</w:t>
+              <w:t>2026-09-15</w:t>
             </w:r>
           </w:p>
         </w:tc>
@@ -199,7 +199,7 @@
         <w:rPr>
           <w:rFonts w:ascii="Consolas" w:hAnsi="Consolas"/>
         </w:rPr>
-        <w:t>git_sha=0071cfc634a64dcb751bd430a4c8d75277a20857</w:t>
+        <w:t>git_sha=104226e0c1bb2c4a46356ca4a52be047e738b6d7</w:t>
       </w:r>
     </w:p>
     <w:p>
@@ -30831,7 +30831,7 @@
           </w:tcPr>
           <w:p>
             <w:r>
-              <w:t>desarrollo</w:t>
+              <w:t>Desarrollo</w:t>
             </w:r>
           </w:p>
         </w:tc>
@@ -30891,7 +30891,7 @@
           </w:tcPr>
           <w:p>
             <w:r>
-              <w:t>performance_artifact</w:t>
+              <w:t>Reusada de la etapa de desempeño</w:t>
             </w:r>
           </w:p>
         </w:tc>
@@ -30901,7 +30901,7 @@
           </w:tcPr>
           <w:p>
             <w:r>
-              <w:t>ok</w:t>
+              <w:t>Evaluada</w:t>
             </w:r>
           </w:p>
         </w:tc>
@@ -30913,7 +30913,7 @@
           </w:tcPr>
           <w:p>
             <w:r>
-              <w:t>holdout</w:t>
+              <w:t>Holdout</w:t>
             </w:r>
           </w:p>
         </w:tc>
@@ -30973,7 +30973,7 @@
           </w:tcPr>
           <w:p>
             <w:r>
-              <w:t>performance_artifact</w:t>
+              <w:t>Reusada de la etapa de desempeño</w:t>
             </w:r>
           </w:p>
         </w:tc>
@@ -30983,7 +30983,7 @@
           </w:tcPr>
           <w:p>
             <w:r>
-              <w:t>ok</w:t>
+              <w:t>Evaluada</w:t>
             </w:r>
           </w:p>
         </w:tc>
@@ -30995,7 +30995,7 @@
           </w:tcPr>
           <w:p>
             <w:r>
-              <w:t>oot</w:t>
+              <w:t>Fuera de tiempo (OOT)</w:t>
             </w:r>
           </w:p>
         </w:tc>
@@ -31055,7 +31055,7 @@
           </w:tcPr>
           <w:p>
             <w:r>
-              <w:t>performance_artifact</w:t>
+              <w:t>Reusada de la etapa de desempeño</w:t>
             </w:r>
           </w:p>
         </w:tc>
@@ -31065,7 +31065,7 @@
           </w:tcPr>
           <w:p>
             <w:r>
-              <w:t>ok</w:t>
+              <w:t>Evaluada</w:t>
             </w:r>
           </w:p>
         </w:tc>
@@ -31292,7 +31292,7 @@
           </w:tcPr>
           <w:p>
             <w:r>
-              <w:t>desarrollo</w:t>
+              <w:t>Desarrollo</w:t>
             </w:r>
           </w:p>
         </w:tc>
@@ -31302,7 +31302,7 @@
           </w:tcPr>
           <w:p>
             <w:r>
-              <w:t>hosmer_lemeshow</w:t>
+              <w:t>Hosmer-Lemeshow</w:t>
             </w:r>
           </w:p>
         </w:tc>
@@ -31312,7 +31312,7 @@
           </w:tcPr>
           <w:p>
             <w:r>
-              <w:t>ALL</w:t>
+              <w:t>—</w:t>
             </w:r>
           </w:p>
         </w:tc>
@@ -31402,7 +31402,7 @@
           </w:tcPr>
           <w:p>
             <w:r>
-              <w:t>pass</w:t>
+              <w:t>Pasa</w:t>
             </w:r>
           </w:p>
         </w:tc>
@@ -31424,7 +31424,7 @@
           </w:tcPr>
           <w:p>
             <w:r>
-              <w:t>desarrollo</w:t>
+              <w:t>Desarrollo</w:t>
             </w:r>
           </w:p>
         </w:tc>
@@ -31434,7 +31434,7 @@
           </w:tcPr>
           <w:p>
             <w:r>
-              <w:t>brier</w:t>
+              <w:t>Puntaje de Brier</w:t>
             </w:r>
           </w:p>
         </w:tc>
@@ -31444,7 +31444,7 @@
           </w:tcPr>
           <w:p>
             <w:r>
-              <w:t>ALL</w:t>
+              <w:t>—</w:t>
             </w:r>
           </w:p>
         </w:tc>
@@ -31534,7 +31534,7 @@
           </w:tcPr>
           <w:p>
             <w:r>
-              <w:t>not_evaluable</w:t>
+              <w:t>Sin veredicto</w:t>
             </w:r>
           </w:p>
         </w:tc>
@@ -31556,7 +31556,7 @@
           </w:tcPr>
           <w:p>
             <w:r>
-              <w:t>oot</w:t>
+              <w:t>Fuera de tiempo (OOT)</w:t>
             </w:r>
           </w:p>
         </w:tc>
@@ -31566,7 +31566,7 @@
           </w:tcPr>
           <w:p>
             <w:r>
-              <w:t>hosmer_lemeshow</w:t>
+              <w:t>Hosmer-Lemeshow</w:t>
             </w:r>
           </w:p>
         </w:tc>
@@ -31576,7 +31576,7 @@
           </w:tcPr>
           <w:p>
             <w:r>
-              <w:t>ALL</w:t>
+              <w:t>—</w:t>
             </w:r>
           </w:p>
         </w:tc>
@@ -31666,7 +31666,7 @@
           </w:tcPr>
           <w:p>
             <w:r>
-              <w:t>fail</w:t>
+              <w:t>Falla</w:t>
             </w:r>
           </w:p>
         </w:tc>
@@ -31688,7 +31688,7 @@
           </w:tcPr>
           <w:p>
             <w:r>
-              <w:t>oot</w:t>
+              <w:t>Fuera de tiempo (OOT)</w:t>
             </w:r>
           </w:p>
         </w:tc>
@@ -31698,7 +31698,7 @@
           </w:tcPr>
           <w:p>
             <w:r>
-              <w:t>brier</w:t>
+              <w:t>Puntaje de Brier</w:t>
             </w:r>
           </w:p>
         </w:tc>
@@ -31708,7 +31708,7 @@
           </w:tcPr>
           <w:p>
             <w:r>
-              <w:t>ALL</w:t>
+              <w:t>—</w:t>
             </w:r>
           </w:p>
         </w:tc>
@@ -31798,7 +31798,7 @@
           </w:tcPr>
           <w:p>
             <w:r>
-              <w:t>not_evaluable</w:t>
+              <w:t>Sin veredicto</w:t>
             </w:r>
           </w:p>
         </w:tc>
@@ -31820,7 +31820,7 @@
           </w:tcPr>
           <w:p>
             <w:r>
-              <w:t>holdout</w:t>
+              <w:t>Holdout</w:t>
             </w:r>
           </w:p>
         </w:tc>
@@ -31830,7 +31830,7 @@
           </w:tcPr>
           <w:p>
             <w:r>
-              <w:t>hosmer_lemeshow</w:t>
+              <w:t>Hosmer-Lemeshow</w:t>
             </w:r>
           </w:p>
         </w:tc>
@@ -31840,7 +31840,7 @@
           </w:tcPr>
           <w:p>
             <w:r>
-              <w:t>ALL</w:t>
+              <w:t>—</w:t>
             </w:r>
           </w:p>
         </w:tc>
@@ -31930,7 +31930,7 @@
           </w:tcPr>
           <w:p>
             <w:r>
-              <w:t>pass</w:t>
+              <w:t>Pasa</w:t>
             </w:r>
           </w:p>
         </w:tc>
@@ -31952,7 +31952,7 @@
           </w:tcPr>
           <w:p>
             <w:r>
-              <w:t>holdout</w:t>
+              <w:t>Holdout</w:t>
             </w:r>
           </w:p>
         </w:tc>
@@ -31962,7 +31962,7 @@
           </w:tcPr>
           <w:p>
             <w:r>
-              <w:t>brier</w:t>
+              <w:t>Puntaje de Brier</w:t>
             </w:r>
           </w:p>
         </w:tc>
@@ -31972,7 +31972,7 @@
           </w:tcPr>
           <w:p>
             <w:r>
-              <w:t>ALL</w:t>
+              <w:t>—</w:t>
             </w:r>
           </w:p>
         </w:tc>
@@ -32062,7 +32062,7 @@
           </w:tcPr>
           <w:p>
             <w:r>
-              <w:t>not_evaluable</w:t>
+              <w:t>Sin veredicto</w:t>
             </w:r>
           </w:p>
         </w:tc>
@@ -32271,17 +32271,17 @@
           </w:tcPr>
           <w:p>
             <w:r>
-              <w:t>score_psi</w:t>
-            </w:r>
-          </w:p>
-        </w:tc>
-        <w:tc>
-          <w:tcPr>
-            <w:tcW w:type="dxa" w:w="785"/>
-          </w:tcPr>
-          <w:p>
-            <w:r>
-              <w:t>dev_vs_holdout</w:t>
+              <w:t>PSI del score</w:t>
+            </w:r>
+          </w:p>
+        </w:tc>
+        <w:tc>
+          <w:tcPr>
+            <w:tcW w:type="dxa" w:w="785"/>
+          </w:tcPr>
+          <w:p>
+            <w:r>
+              <w:t>Desarrollo vs. Holdout</w:t>
             </w:r>
           </w:p>
         </w:tc>
@@ -32331,7 +32331,7 @@
           </w:tcPr>
           <w:p>
             <w:r>
-              <w:t>stable</w:t>
+              <w:t>Estable</w:t>
             </w:r>
           </w:p>
         </w:tc>
@@ -32351,27 +32351,27 @@
           </w:tcPr>
           <w:p>
             <w:r>
-              <w:t>stability_artifact</w:t>
-            </w:r>
-          </w:p>
-        </w:tc>
-        <w:tc>
-          <w:tcPr>
-            <w:tcW w:type="dxa" w:w="785"/>
-          </w:tcPr>
-          <w:p>
-            <w:r>
-              <w:t>ok</w:t>
-            </w:r>
-          </w:p>
-        </w:tc>
-        <w:tc>
-          <w:tcPr>
-            <w:tcW w:type="dxa" w:w="785"/>
-          </w:tcPr>
-          <w:p>
-            <w:r>
-              <w:t>pass</w:t>
+              <w:t>Reusado de la etapa de estabilidad</w:t>
+            </w:r>
+          </w:p>
+        </w:tc>
+        <w:tc>
+          <w:tcPr>
+            <w:tcW w:type="dxa" w:w="785"/>
+          </w:tcPr>
+          <w:p>
+            <w:r>
+              <w:t>Evaluada</w:t>
+            </w:r>
+          </w:p>
+        </w:tc>
+        <w:tc>
+          <w:tcPr>
+            <w:tcW w:type="dxa" w:w="785"/>
+          </w:tcPr>
+          <w:p>
+            <w:r>
+              <w:t>Pasa</w:t>
             </w:r>
           </w:p>
         </w:tc>
@@ -32383,17 +32383,17 @@
           </w:tcPr>
           <w:p>
             <w:r>
-              <w:t>score_psi</w:t>
-            </w:r>
-          </w:p>
-        </w:tc>
-        <w:tc>
-          <w:tcPr>
-            <w:tcW w:type="dxa" w:w="785"/>
-          </w:tcPr>
-          <w:p>
-            <w:r>
-              <w:t>dev_vs_oot</w:t>
+              <w:t>PSI del score</w:t>
+            </w:r>
+          </w:p>
+        </w:tc>
+        <w:tc>
+          <w:tcPr>
+            <w:tcW w:type="dxa" w:w="785"/>
+          </w:tcPr>
+          <w:p>
+            <w:r>
+              <w:t>Desarrollo vs. OOT</w:t>
             </w:r>
           </w:p>
         </w:tc>
@@ -32443,7 +32443,7 @@
           </w:tcPr>
           <w:p>
             <w:r>
-              <w:t>stable</w:t>
+              <w:t>Estable</w:t>
             </w:r>
           </w:p>
         </w:tc>
@@ -32463,27 +32463,27 @@
           </w:tcPr>
           <w:p>
             <w:r>
-              <w:t>stability_artifact</w:t>
-            </w:r>
-          </w:p>
-        </w:tc>
-        <w:tc>
-          <w:tcPr>
-            <w:tcW w:type="dxa" w:w="785"/>
-          </w:tcPr>
-          <w:p>
-            <w:r>
-              <w:t>ok</w:t>
-            </w:r>
-          </w:p>
-        </w:tc>
-        <w:tc>
-          <w:tcPr>
-            <w:tcW w:type="dxa" w:w="785"/>
-          </w:tcPr>
-          <w:p>
-            <w:r>
-              <w:t>pass</w:t>
+              <w:t>Reusado de la etapa de estabilidad</w:t>
+            </w:r>
+          </w:p>
+        </w:tc>
+        <w:tc>
+          <w:tcPr>
+            <w:tcW w:type="dxa" w:w="785"/>
+          </w:tcPr>
+          <w:p>
+            <w:r>
+              <w:t>Evaluada</w:t>
+            </w:r>
+          </w:p>
+        </w:tc>
+        <w:tc>
+          <w:tcPr>
+            <w:tcW w:type="dxa" w:w="785"/>
+          </w:tcPr>
+          <w:p>
+            <w:r>
+              <w:t>Pasa</w:t>
             </w:r>
           </w:p>
         </w:tc>
@@ -32495,17 +32495,17 @@
           </w:tcPr>
           <w:p>
             <w:r>
-              <w:t>pd_psi</w:t>
-            </w:r>
-          </w:p>
-        </w:tc>
-        <w:tc>
-          <w:tcPr>
-            <w:tcW w:type="dxa" w:w="785"/>
-          </w:tcPr>
-          <w:p>
-            <w:r>
-              <w:t>dev_vs_holdout</w:t>
+              <w:t>PSI de la PD</w:t>
+            </w:r>
+          </w:p>
+        </w:tc>
+        <w:tc>
+          <w:tcPr>
+            <w:tcW w:type="dxa" w:w="785"/>
+          </w:tcPr>
+          <w:p>
+            <w:r>
+              <w:t>Desarrollo vs. Holdout</w:t>
             </w:r>
           </w:p>
         </w:tc>
@@ -32555,7 +32555,7 @@
           </w:tcPr>
           <w:p>
             <w:r>
-              <w:t>stable</w:t>
+              <w:t>Estable</w:t>
             </w:r>
           </w:p>
         </w:tc>
@@ -32575,27 +32575,27 @@
           </w:tcPr>
           <w:p>
             <w:r>
-              <w:t>stability_artifact</w:t>
-            </w:r>
-          </w:p>
-        </w:tc>
-        <w:tc>
-          <w:tcPr>
-            <w:tcW w:type="dxa" w:w="785"/>
-          </w:tcPr>
-          <w:p>
-            <w:r>
-              <w:t>ok</w:t>
-            </w:r>
-          </w:p>
-        </w:tc>
-        <w:tc>
-          <w:tcPr>
-            <w:tcW w:type="dxa" w:w="785"/>
-          </w:tcPr>
-          <w:p>
-            <w:r>
-              <w:t>pass</w:t>
+              <w:t>Reusado de la etapa de estabilidad</w:t>
+            </w:r>
+          </w:p>
+        </w:tc>
+        <w:tc>
+          <w:tcPr>
+            <w:tcW w:type="dxa" w:w="785"/>
+          </w:tcPr>
+          <w:p>
+            <w:r>
+              <w:t>Evaluada</w:t>
+            </w:r>
+          </w:p>
+        </w:tc>
+        <w:tc>
+          <w:tcPr>
+            <w:tcW w:type="dxa" w:w="785"/>
+          </w:tcPr>
+          <w:p>
+            <w:r>
+              <w:t>Pasa</w:t>
             </w:r>
           </w:p>
         </w:tc>
@@ -32607,17 +32607,17 @@
           </w:tcPr>
           <w:p>
             <w:r>
-              <w:t>pd_psi</w:t>
-            </w:r>
-          </w:p>
-        </w:tc>
-        <w:tc>
-          <w:tcPr>
-            <w:tcW w:type="dxa" w:w="785"/>
-          </w:tcPr>
-          <w:p>
-            <w:r>
-              <w:t>dev_vs_oot</w:t>
+              <w:t>PSI de la PD</w:t>
+            </w:r>
+          </w:p>
+        </w:tc>
+        <w:tc>
+          <w:tcPr>
+            <w:tcW w:type="dxa" w:w="785"/>
+          </w:tcPr>
+          <w:p>
+            <w:r>
+              <w:t>Desarrollo vs. OOT</w:t>
             </w:r>
           </w:p>
         </w:tc>
@@ -32667,7 +32667,7 @@
           </w:tcPr>
           <w:p>
             <w:r>
-              <w:t>stable</w:t>
+              <w:t>Estable</w:t>
             </w:r>
           </w:p>
         </w:tc>
@@ -32687,27 +32687,27 @@
           </w:tcPr>
           <w:p>
             <w:r>
-              <w:t>stability_artifact</w:t>
-            </w:r>
-          </w:p>
-        </w:tc>
-        <w:tc>
-          <w:tcPr>
-            <w:tcW w:type="dxa" w:w="785"/>
-          </w:tcPr>
-          <w:p>
-            <w:r>
-              <w:t>ok</w:t>
-            </w:r>
-          </w:p>
-        </w:tc>
-        <w:tc>
-          <w:tcPr>
-            <w:tcW w:type="dxa" w:w="785"/>
-          </w:tcPr>
-          <w:p>
-            <w:r>
-              <w:t>pass</w:t>
+              <w:t>Reusado de la etapa de estabilidad</w:t>
+            </w:r>
+          </w:p>
+        </w:tc>
+        <w:tc>
+          <w:tcPr>
+            <w:tcW w:type="dxa" w:w="785"/>
+          </w:tcPr>
+          <w:p>
+            <w:r>
+              <w:t>Evaluada</w:t>
+            </w:r>
+          </w:p>
+        </w:tc>
+        <w:tc>
+          <w:tcPr>
+            <w:tcW w:type="dxa" w:w="785"/>
+          </w:tcPr>
+          <w:p>
+            <w:r>
+              <w:t>Pasa</w:t>
             </w:r>
           </w:p>
         </w:tc>
@@ -32719,17 +32719,17 @@
           </w:tcPr>
           <w:p>
             <w:r>
-              <w:t>csi</w:t>
-            </w:r>
-          </w:p>
-        </w:tc>
-        <w:tc>
-          <w:tcPr>
-            <w:tcW w:type="dxa" w:w="785"/>
-          </w:tcPr>
-          <w:p>
-            <w:r>
-              <w:t>dev_vs_holdout</w:t>
+              <w:t>CSI</w:t>
+            </w:r>
+          </w:p>
+        </w:tc>
+        <w:tc>
+          <w:tcPr>
+            <w:tcW w:type="dxa" w:w="785"/>
+          </w:tcPr>
+          <w:p>
+            <w:r>
+              <w:t>Desarrollo vs. Holdout</w:t>
             </w:r>
           </w:p>
         </w:tc>
@@ -32779,7 +32779,7 @@
           </w:tcPr>
           <w:p>
             <w:r>
-              <w:t>stable</w:t>
+              <w:t>Estable</w:t>
             </w:r>
           </w:p>
         </w:tc>
@@ -32799,27 +32799,27 @@
           </w:tcPr>
           <w:p>
             <w:r>
-              <w:t>stability_artifact</w:t>
-            </w:r>
-          </w:p>
-        </w:tc>
-        <w:tc>
-          <w:tcPr>
-            <w:tcW w:type="dxa" w:w="785"/>
-          </w:tcPr>
-          <w:p>
-            <w:r>
-              <w:t>ok</w:t>
-            </w:r>
-          </w:p>
-        </w:tc>
-        <w:tc>
-          <w:tcPr>
-            <w:tcW w:type="dxa" w:w="785"/>
-          </w:tcPr>
-          <w:p>
-            <w:r>
-              <w:t>pass</w:t>
+              <w:t>Reusado de la etapa de estabilidad</w:t>
+            </w:r>
+          </w:p>
+        </w:tc>
+        <w:tc>
+          <w:tcPr>
+            <w:tcW w:type="dxa" w:w="785"/>
+          </w:tcPr>
+          <w:p>
+            <w:r>
+              <w:t>Evaluada</w:t>
+            </w:r>
+          </w:p>
+        </w:tc>
+        <w:tc>
+          <w:tcPr>
+            <w:tcW w:type="dxa" w:w="785"/>
+          </w:tcPr>
+          <w:p>
+            <w:r>
+              <w:t>Pasa</w:t>
             </w:r>
           </w:p>
         </w:tc>
@@ -32831,17 +32831,17 @@
           </w:tcPr>
           <w:p>
             <w:r>
-              <w:t>csi</w:t>
-            </w:r>
-          </w:p>
-        </w:tc>
-        <w:tc>
-          <w:tcPr>
-            <w:tcW w:type="dxa" w:w="785"/>
-          </w:tcPr>
-          <w:p>
-            <w:r>
-              <w:t>dev_vs_oot</w:t>
+              <w:t>CSI</w:t>
+            </w:r>
+          </w:p>
+        </w:tc>
+        <w:tc>
+          <w:tcPr>
+            <w:tcW w:type="dxa" w:w="785"/>
+          </w:tcPr>
+          <w:p>
+            <w:r>
+              <w:t>Desarrollo vs. OOT</w:t>
             </w:r>
           </w:p>
         </w:tc>
@@ -32891,7 +32891,7 @@
           </w:tcPr>
           <w:p>
             <w:r>
-              <w:t>stable</w:t>
+              <w:t>Estable</w:t>
             </w:r>
           </w:p>
         </w:tc>
@@ -32911,27 +32911,27 @@
           </w:tcPr>
           <w:p>
             <w:r>
-              <w:t>stability_artifact</w:t>
-            </w:r>
-          </w:p>
-        </w:tc>
-        <w:tc>
-          <w:tcPr>
-            <w:tcW w:type="dxa" w:w="785"/>
-          </w:tcPr>
-          <w:p>
-            <w:r>
-              <w:t>ok</w:t>
-            </w:r>
-          </w:p>
-        </w:tc>
-        <w:tc>
-          <w:tcPr>
-            <w:tcW w:type="dxa" w:w="785"/>
-          </w:tcPr>
-          <w:p>
-            <w:r>
-              <w:t>pass</w:t>
+              <w:t>Reusado de la etapa de estabilidad</w:t>
+            </w:r>
+          </w:p>
+        </w:tc>
+        <w:tc>
+          <w:tcPr>
+            <w:tcW w:type="dxa" w:w="785"/>
+          </w:tcPr>
+          <w:p>
+            <w:r>
+              <w:t>Evaluada</w:t>
+            </w:r>
+          </w:p>
+        </w:tc>
+        <w:tc>
+          <w:tcPr>
+            <w:tcW w:type="dxa" w:w="785"/>
+          </w:tcPr>
+          <w:p>
+            <w:r>
+              <w:t>Pasa</w:t>
             </w:r>
           </w:p>
         </w:tc>
@@ -32943,17 +32943,17 @@
           </w:tcPr>
           <w:p>
             <w:r>
-              <w:t>csi</w:t>
-            </w:r>
-          </w:p>
-        </w:tc>
-        <w:tc>
-          <w:tcPr>
-            <w:tcW w:type="dxa" w:w="785"/>
-          </w:tcPr>
-          <w:p>
-            <w:r>
-              <w:t>dev_vs_holdout</w:t>
+              <w:t>CSI</w:t>
+            </w:r>
+          </w:p>
+        </w:tc>
+        <w:tc>
+          <w:tcPr>
+            <w:tcW w:type="dxa" w:w="785"/>
+          </w:tcPr>
+          <w:p>
+            <w:r>
+              <w:t>Desarrollo vs. Holdout</w:t>
             </w:r>
           </w:p>
         </w:tc>
@@ -33003,7 +33003,7 @@
           </w:tcPr>
           <w:p>
             <w:r>
-              <w:t>stable</w:t>
+              <w:t>Estable</w:t>
             </w:r>
           </w:p>
         </w:tc>
@@ -33023,27 +33023,27 @@
           </w:tcPr>
           <w:p>
             <w:r>
-              <w:t>stability_artifact</w:t>
-            </w:r>
-          </w:p>
-        </w:tc>
-        <w:tc>
-          <w:tcPr>
-            <w:tcW w:type="dxa" w:w="785"/>
-          </w:tcPr>
-          <w:p>
-            <w:r>
-              <w:t>ok</w:t>
-            </w:r>
-          </w:p>
-        </w:tc>
-        <w:tc>
-          <w:tcPr>
-            <w:tcW w:type="dxa" w:w="785"/>
-          </w:tcPr>
-          <w:p>
-            <w:r>
-              <w:t>pass</w:t>
+              <w:t>Reusado de la etapa de estabilidad</w:t>
+            </w:r>
+          </w:p>
+        </w:tc>
+        <w:tc>
+          <w:tcPr>
+            <w:tcW w:type="dxa" w:w="785"/>
+          </w:tcPr>
+          <w:p>
+            <w:r>
+              <w:t>Evaluada</w:t>
+            </w:r>
+          </w:p>
+        </w:tc>
+        <w:tc>
+          <w:tcPr>
+            <w:tcW w:type="dxa" w:w="785"/>
+          </w:tcPr>
+          <w:p>
+            <w:r>
+              <w:t>Pasa</w:t>
             </w:r>
           </w:p>
         </w:tc>
@@ -33055,17 +33055,17 @@
           </w:tcPr>
           <w:p>
             <w:r>
-              <w:t>csi</w:t>
-            </w:r>
-          </w:p>
-        </w:tc>
-        <w:tc>
-          <w:tcPr>
-            <w:tcW w:type="dxa" w:w="785"/>
-          </w:tcPr>
-          <w:p>
-            <w:r>
-              <w:t>dev_vs_oot</w:t>
+              <w:t>CSI</w:t>
+            </w:r>
+          </w:p>
+        </w:tc>
+        <w:tc>
+          <w:tcPr>
+            <w:tcW w:type="dxa" w:w="785"/>
+          </w:tcPr>
+          <w:p>
+            <w:r>
+              <w:t>Desarrollo vs. OOT</w:t>
             </w:r>
           </w:p>
         </w:tc>
@@ -33115,7 +33115,7 @@
           </w:tcPr>
           <w:p>
             <w:r>
-              <w:t>stable</w:t>
+              <w:t>Estable</w:t>
             </w:r>
           </w:p>
         </w:tc>
@@ -33135,27 +33135,27 @@
           </w:tcPr>
           <w:p>
             <w:r>
-              <w:t>stability_artifact</w:t>
-            </w:r>
-          </w:p>
-        </w:tc>
-        <w:tc>
-          <w:tcPr>
-            <w:tcW w:type="dxa" w:w="785"/>
-          </w:tcPr>
-          <w:p>
-            <w:r>
-              <w:t>ok</w:t>
-            </w:r>
-          </w:p>
-        </w:tc>
-        <w:tc>
-          <w:tcPr>
-            <w:tcW w:type="dxa" w:w="785"/>
-          </w:tcPr>
-          <w:p>
-            <w:r>
-              <w:t>pass</w:t>
+              <w:t>Reusado de la etapa de estabilidad</w:t>
+            </w:r>
+          </w:p>
+        </w:tc>
+        <w:tc>
+          <w:tcPr>
+            <w:tcW w:type="dxa" w:w="785"/>
+          </w:tcPr>
+          <w:p>
+            <w:r>
+              <w:t>Evaluada</w:t>
+            </w:r>
+          </w:p>
+        </w:tc>
+        <w:tc>
+          <w:tcPr>
+            <w:tcW w:type="dxa" w:w="785"/>
+          </w:tcPr>
+          <w:p>
+            <w:r>
+              <w:t>Pasa</w:t>
             </w:r>
           </w:p>
         </w:tc>
@@ -33167,17 +33167,17 @@
           </w:tcPr>
           <w:p>
             <w:r>
-              <w:t>csi</w:t>
-            </w:r>
-          </w:p>
-        </w:tc>
-        <w:tc>
-          <w:tcPr>
-            <w:tcW w:type="dxa" w:w="785"/>
-          </w:tcPr>
-          <w:p>
-            <w:r>
-              <w:t>dev_vs_holdout</w:t>
+              <w:t>CSI</w:t>
+            </w:r>
+          </w:p>
+        </w:tc>
+        <w:tc>
+          <w:tcPr>
+            <w:tcW w:type="dxa" w:w="785"/>
+          </w:tcPr>
+          <w:p>
+            <w:r>
+              <w:t>Desarrollo vs. Holdout</w:t>
             </w:r>
           </w:p>
         </w:tc>
@@ -33227,7 +33227,7 @@
           </w:tcPr>
           <w:p>
             <w:r>
-              <w:t>stable</w:t>
+              <w:t>Estable</w:t>
             </w:r>
           </w:p>
         </w:tc>
@@ -33247,27 +33247,27 @@
           </w:tcPr>
           <w:p>
             <w:r>
-              <w:t>stability_artifact</w:t>
-            </w:r>
-          </w:p>
-        </w:tc>
-        <w:tc>
-          <w:tcPr>
-            <w:tcW w:type="dxa" w:w="785"/>
-          </w:tcPr>
-          <w:p>
-            <w:r>
-              <w:t>ok</w:t>
-            </w:r>
-          </w:p>
-        </w:tc>
-        <w:tc>
-          <w:tcPr>
-            <w:tcW w:type="dxa" w:w="785"/>
-          </w:tcPr>
-          <w:p>
-            <w:r>
-              <w:t>pass</w:t>
+              <w:t>Reusado de la etapa de estabilidad</w:t>
+            </w:r>
+          </w:p>
+        </w:tc>
+        <w:tc>
+          <w:tcPr>
+            <w:tcW w:type="dxa" w:w="785"/>
+          </w:tcPr>
+          <w:p>
+            <w:r>
+              <w:t>Evaluada</w:t>
+            </w:r>
+          </w:p>
+        </w:tc>
+        <w:tc>
+          <w:tcPr>
+            <w:tcW w:type="dxa" w:w="785"/>
+          </w:tcPr>
+          <w:p>
+            <w:r>
+              <w:t>Pasa</w:t>
             </w:r>
           </w:p>
         </w:tc>
@@ -33279,17 +33279,17 @@
           </w:tcPr>
           <w:p>
             <w:r>
-              <w:t>csi</w:t>
-            </w:r>
-          </w:p>
-        </w:tc>
-        <w:tc>
-          <w:tcPr>
-            <w:tcW w:type="dxa" w:w="785"/>
-          </w:tcPr>
-          <w:p>
-            <w:r>
-              <w:t>dev_vs_oot</w:t>
+              <w:t>CSI</w:t>
+            </w:r>
+          </w:p>
+        </w:tc>
+        <w:tc>
+          <w:tcPr>
+            <w:tcW w:type="dxa" w:w="785"/>
+          </w:tcPr>
+          <w:p>
+            <w:r>
+              <w:t>Desarrollo vs. OOT</w:t>
             </w:r>
           </w:p>
         </w:tc>
@@ -33339,7 +33339,7 @@
           </w:tcPr>
           <w:p>
             <w:r>
-              <w:t>stable</w:t>
+              <w:t>Estable</w:t>
             </w:r>
           </w:p>
         </w:tc>
@@ -33359,27 +33359,27 @@
           </w:tcPr>
           <w:p>
             <w:r>
-              <w:t>stability_artifact</w:t>
-            </w:r>
-          </w:p>
-        </w:tc>
-        <w:tc>
-          <w:tcPr>
-            <w:tcW w:type="dxa" w:w="785"/>
-          </w:tcPr>
-          <w:p>
-            <w:r>
-              <w:t>ok</w:t>
-            </w:r>
-          </w:p>
-        </w:tc>
-        <w:tc>
-          <w:tcPr>
-            <w:tcW w:type="dxa" w:w="785"/>
-          </w:tcPr>
-          <w:p>
-            <w:r>
-              <w:t>pass</w:t>
+              <w:t>Reusado de la etapa de estabilidad</w:t>
+            </w:r>
+          </w:p>
+        </w:tc>
+        <w:tc>
+          <w:tcPr>
+            <w:tcW w:type="dxa" w:w="785"/>
+          </w:tcPr>
+          <w:p>
+            <w:r>
+              <w:t>Evaluada</w:t>
+            </w:r>
+          </w:p>
+        </w:tc>
+        <w:tc>
+          <w:tcPr>
+            <w:tcW w:type="dxa" w:w="785"/>
+          </w:tcPr>
+          <w:p>
+            <w:r>
+              <w:t>Pasa</w:t>
             </w:r>
           </w:p>
         </w:tc>
@@ -33391,17 +33391,17 @@
           </w:tcPr>
           <w:p>
             <w:r>
-              <w:t>csi</w:t>
-            </w:r>
-          </w:p>
-        </w:tc>
-        <w:tc>
-          <w:tcPr>
-            <w:tcW w:type="dxa" w:w="785"/>
-          </w:tcPr>
-          <w:p>
-            <w:r>
-              <w:t>dev_vs_holdout</w:t>
+              <w:t>CSI</w:t>
+            </w:r>
+          </w:p>
+        </w:tc>
+        <w:tc>
+          <w:tcPr>
+            <w:tcW w:type="dxa" w:w="785"/>
+          </w:tcPr>
+          <w:p>
+            <w:r>
+              <w:t>Desarrollo vs. Holdout</w:t>
             </w:r>
           </w:p>
         </w:tc>
@@ -33451,7 +33451,7 @@
           </w:tcPr>
           <w:p>
             <w:r>
-              <w:t>stable</w:t>
+              <w:t>Estable</w:t>
             </w:r>
           </w:p>
         </w:tc>
@@ -33471,27 +33471,27 @@
           </w:tcPr>
           <w:p>
             <w:r>
-              <w:t>stability_artifact</w:t>
-            </w:r>
-          </w:p>
-        </w:tc>
-        <w:tc>
-          <w:tcPr>
-            <w:tcW w:type="dxa" w:w="785"/>
-          </w:tcPr>
-          <w:p>
-            <w:r>
-              <w:t>ok</w:t>
-            </w:r>
-          </w:p>
-        </w:tc>
-        <w:tc>
-          <w:tcPr>
-            <w:tcW w:type="dxa" w:w="785"/>
-          </w:tcPr>
-          <w:p>
-            <w:r>
-              <w:t>pass</w:t>
+              <w:t>Reusado de la etapa de estabilidad</w:t>
+            </w:r>
+          </w:p>
+        </w:tc>
+        <w:tc>
+          <w:tcPr>
+            <w:tcW w:type="dxa" w:w="785"/>
+          </w:tcPr>
+          <w:p>
+            <w:r>
+              <w:t>Evaluada</w:t>
+            </w:r>
+          </w:p>
+        </w:tc>
+        <w:tc>
+          <w:tcPr>
+            <w:tcW w:type="dxa" w:w="785"/>
+          </w:tcPr>
+          <w:p>
+            <w:r>
+              <w:t>Pasa</w:t>
             </w:r>
           </w:p>
         </w:tc>
@@ -33503,17 +33503,17 @@
           </w:tcPr>
           <w:p>
             <w:r>
-              <w:t>csi</w:t>
-            </w:r>
-          </w:p>
-        </w:tc>
-        <w:tc>
-          <w:tcPr>
-            <w:tcW w:type="dxa" w:w="785"/>
-          </w:tcPr>
-          <w:p>
-            <w:r>
-              <w:t>dev_vs_oot</w:t>
+              <w:t>CSI</w:t>
+            </w:r>
+          </w:p>
+        </w:tc>
+        <w:tc>
+          <w:tcPr>
+            <w:tcW w:type="dxa" w:w="785"/>
+          </w:tcPr>
+          <w:p>
+            <w:r>
+              <w:t>Desarrollo vs. OOT</w:t>
             </w:r>
           </w:p>
         </w:tc>
@@ -33563,7 +33563,7 @@
           </w:tcPr>
           <w:p>
             <w:r>
-              <w:t>stable</w:t>
+              <w:t>Estable</w:t>
             </w:r>
           </w:p>
         </w:tc>
@@ -33583,27 +33583,27 @@
           </w:tcPr>
           <w:p>
             <w:r>
-              <w:t>stability_artifact</w:t>
-            </w:r>
-          </w:p>
-        </w:tc>
-        <w:tc>
-          <w:tcPr>
-            <w:tcW w:type="dxa" w:w="785"/>
-          </w:tcPr>
-          <w:p>
-            <w:r>
-              <w:t>ok</w:t>
-            </w:r>
-          </w:p>
-        </w:tc>
-        <w:tc>
-          <w:tcPr>
-            <w:tcW w:type="dxa" w:w="785"/>
-          </w:tcPr>
-          <w:p>
-            <w:r>
-              <w:t>pass</w:t>
+              <w:t>Reusado de la etapa de estabilidad</w:t>
+            </w:r>
+          </w:p>
+        </w:tc>
+        <w:tc>
+          <w:tcPr>
+            <w:tcW w:type="dxa" w:w="785"/>
+          </w:tcPr>
+          <w:p>
+            <w:r>
+              <w:t>Evaluada</w:t>
+            </w:r>
+          </w:p>
+        </w:tc>
+        <w:tc>
+          <w:tcPr>
+            <w:tcW w:type="dxa" w:w="785"/>
+          </w:tcPr>
+          <w:p>
+            <w:r>
+              <w:t>Pasa</w:t>
             </w:r>
           </w:p>
         </w:tc>
@@ -33615,17 +33615,17 @@
           </w:tcPr>
           <w:p>
             <w:r>
-              <w:t>csi</w:t>
-            </w:r>
-          </w:p>
-        </w:tc>
-        <w:tc>
-          <w:tcPr>
-            <w:tcW w:type="dxa" w:w="785"/>
-          </w:tcPr>
-          <w:p>
-            <w:r>
-              <w:t>dev_vs_holdout</w:t>
+              <w:t>CSI</w:t>
+            </w:r>
+          </w:p>
+        </w:tc>
+        <w:tc>
+          <w:tcPr>
+            <w:tcW w:type="dxa" w:w="785"/>
+          </w:tcPr>
+          <w:p>
+            <w:r>
+              <w:t>Desarrollo vs. Holdout</w:t>
             </w:r>
           </w:p>
         </w:tc>
@@ -33675,7 +33675,7 @@
           </w:tcPr>
           <w:p>
             <w:r>
-              <w:t>stable</w:t>
+              <w:t>Estable</w:t>
             </w:r>
           </w:p>
         </w:tc>
@@ -33695,27 +33695,27 @@
           </w:tcPr>
           <w:p>
             <w:r>
-              <w:t>stability_artifact</w:t>
-            </w:r>
-          </w:p>
-        </w:tc>
-        <w:tc>
-          <w:tcPr>
-            <w:tcW w:type="dxa" w:w="785"/>
-          </w:tcPr>
-          <w:p>
-            <w:r>
-              <w:t>ok</w:t>
-            </w:r>
-          </w:p>
-        </w:tc>
-        <w:tc>
-          <w:tcPr>
-            <w:tcW w:type="dxa" w:w="785"/>
-          </w:tcPr>
-          <w:p>
-            <w:r>
-              <w:t>pass</w:t>
+              <w:t>Reusado de la etapa de estabilidad</w:t>
+            </w:r>
+          </w:p>
+        </w:tc>
+        <w:tc>
+          <w:tcPr>
+            <w:tcW w:type="dxa" w:w="785"/>
+          </w:tcPr>
+          <w:p>
+            <w:r>
+              <w:t>Evaluada</w:t>
+            </w:r>
+          </w:p>
+        </w:tc>
+        <w:tc>
+          <w:tcPr>
+            <w:tcW w:type="dxa" w:w="785"/>
+          </w:tcPr>
+          <w:p>
+            <w:r>
+              <w:t>Pasa</w:t>
             </w:r>
           </w:p>
         </w:tc>
@@ -33727,17 +33727,17 @@
           </w:tcPr>
           <w:p>
             <w:r>
-              <w:t>csi</w:t>
-            </w:r>
-          </w:p>
-        </w:tc>
-        <w:tc>
-          <w:tcPr>
-            <w:tcW w:type="dxa" w:w="785"/>
-          </w:tcPr>
-          <w:p>
-            <w:r>
-              <w:t>dev_vs_oot</w:t>
+              <w:t>CSI</w:t>
+            </w:r>
+          </w:p>
+        </w:tc>
+        <w:tc>
+          <w:tcPr>
+            <w:tcW w:type="dxa" w:w="785"/>
+          </w:tcPr>
+          <w:p>
+            <w:r>
+              <w:t>Desarrollo vs. OOT</w:t>
             </w:r>
           </w:p>
         </w:tc>
@@ -33787,7 +33787,7 @@
           </w:tcPr>
           <w:p>
             <w:r>
-              <w:t>stable</w:t>
+              <w:t>Estable</w:t>
             </w:r>
           </w:p>
         </w:tc>
@@ -33807,27 +33807,27 @@
           </w:tcPr>
           <w:p>
             <w:r>
-              <w:t>stability_artifact</w:t>
-            </w:r>
-          </w:p>
-        </w:tc>
-        <w:tc>
-          <w:tcPr>
-            <w:tcW w:type="dxa" w:w="785"/>
-          </w:tcPr>
-          <w:p>
-            <w:r>
-              <w:t>ok</w:t>
-            </w:r>
-          </w:p>
-        </w:tc>
-        <w:tc>
-          <w:tcPr>
-            <w:tcW w:type="dxa" w:w="785"/>
-          </w:tcPr>
-          <w:p>
-            <w:r>
-              <w:t>pass</w:t>
+              <w:t>Reusado de la etapa de estabilidad</w:t>
+            </w:r>
+          </w:p>
+        </w:tc>
+        <w:tc>
+          <w:tcPr>
+            <w:tcW w:type="dxa" w:w="785"/>
+          </w:tcPr>
+          <w:p>
+            <w:r>
+              <w:t>Evaluada</w:t>
+            </w:r>
+          </w:p>
+        </w:tc>
+        <w:tc>
+          <w:tcPr>
+            <w:tcW w:type="dxa" w:w="785"/>
+          </w:tcPr>
+          <w:p>
+            <w:r>
+              <w:t>Pasa</w:t>
             </w:r>
           </w:p>
         </w:tc>
@@ -33839,17 +33839,17 @@
           </w:tcPr>
           <w:p>
             <w:r>
-              <w:t>temporal_score</w:t>
-            </w:r>
-          </w:p>
-        </w:tc>
-        <w:tc>
-          <w:tcPr>
-            <w:tcW w:type="dxa" w:w="785"/>
-          </w:tcPr>
-          <w:p>
-            <w:r>
-              <w:t>period</w:t>
+              <w:t>PSI temporal</w:t>
+            </w:r>
+          </w:p>
+        </w:tc>
+        <w:tc>
+          <w:tcPr>
+            <w:tcW w:type="dxa" w:w="785"/>
+          </w:tcPr>
+          <w:p>
+            <w:r>
+              <w:t>Período</w:t>
             </w:r>
           </w:p>
         </w:tc>
@@ -33899,7 +33899,7 @@
           </w:tcPr>
           <w:p>
             <w:r>
-              <w:t>stable</w:t>
+              <w:t>Estable</w:t>
             </w:r>
           </w:p>
         </w:tc>
@@ -33919,27 +33919,27 @@
           </w:tcPr>
           <w:p>
             <w:r>
-              <w:t>stability_artifact</w:t>
-            </w:r>
-          </w:p>
-        </w:tc>
-        <w:tc>
-          <w:tcPr>
-            <w:tcW w:type="dxa" w:w="785"/>
-          </w:tcPr>
-          <w:p>
-            <w:r>
-              <w:t>ok</w:t>
-            </w:r>
-          </w:p>
-        </w:tc>
-        <w:tc>
-          <w:tcPr>
-            <w:tcW w:type="dxa" w:w="785"/>
-          </w:tcPr>
-          <w:p>
-            <w:r>
-              <w:t>pass</w:t>
+              <w:t>Reusado de la etapa de estabilidad</w:t>
+            </w:r>
+          </w:p>
+        </w:tc>
+        <w:tc>
+          <w:tcPr>
+            <w:tcW w:type="dxa" w:w="785"/>
+          </w:tcPr>
+          <w:p>
+            <w:r>
+              <w:t>Evaluada</w:t>
+            </w:r>
+          </w:p>
+        </w:tc>
+        <w:tc>
+          <w:tcPr>
+            <w:tcW w:type="dxa" w:w="785"/>
+          </w:tcPr>
+          <w:p>
+            <w:r>
+              <w:t>Pasa</w:t>
             </w:r>
           </w:p>
         </w:tc>
@@ -34084,7 +34084,7 @@
         <w:rPr>
           <w:rFonts w:ascii="Consolas" w:hAnsi="Consolas"/>
         </w:rPr>
-        <w:t>2026-09-12T19:00:39.378322Z</w:t>
+        <w:t>2026-09-15T13:26:21.606254Z</w:t>
       </w:r>
     </w:p>
     <w:p>
@@ -34148,7 +34148,7 @@
         <w:rPr>
           <w:rFonts w:ascii="Consolas" w:hAnsi="Consolas"/>
         </w:rPr>
-        <w:t>0071cfc634a64dcb751bd430a4c8d75277a20857</w:t>
+        <w:t>104226e0c1bb2c4a46356ca4a52be047e738b6d7</w:t>
       </w:r>
     </w:p>
     <w:p>
@@ -34168,7 +34168,7 @@
         <w:br/>
         <w:t xml:space="preserve">  "PyYAML": "6.0.3",</w:t>
         <w:br/>
-        <w:t xml:space="preserve">  "nikodym": "1.14.0",</w:t>
+        <w:t xml:space="preserve">  "nikodym": "1.16.0",</w:t>
         <w:br/>
         <w:t xml:space="preserve">  "numpy": "2.4.6",</w:t>
         <w:br/>
@@ -34208,7 +34208,7 @@
         <w:rPr>
           <w:rFonts w:ascii="Consolas" w:hAnsi="Consolas"/>
         </w:rPr>
-        <w:t>ad15acc13aedcc100420376791828c476418ae6f4407b858d9b5f64273dbcc0b</w:t>
+        <w:t>55e3e6faca67ce0ada608c8aa3f9bedba5e7d1348837dda23ed676d8f3b58270</w:t>
       </w:r>
     </w:p>
     <w:p>
@@ -46383,13 +46383,21 @@
         <w:br/>
         <w:t xml:space="preserve">  ],</w:t>
         <w:br/>
+        <w:t xml:space="preserve">  "min_rows_per_group": 30,</w:t>
+        <w:br/>
         <w:t xml:space="preserve">  "n_failed": 1,</w:t>
         <w:br/>
         <w:t xml:space="preserve">  "n_tests": 3,</w:t>
         <w:br/>
         <w:t xml:space="preserve">  "not_evaluable_grades": [],</w:t>
         <w:br/>
+        <w:t xml:space="preserve">  "not_evaluable_partitions": [],</w:t>
+        <w:br/>
         <w:t xml:space="preserve">  "overall_status": "fail",</w:t>
+        <w:br/>
+        <w:t xml:space="preserve">  "stability_recompute": null,</w:t>
+        <w:br/>
+        <w:t xml:space="preserve">  "stability_source": "stability_artifact",</w:t>
         <w:br/>
         <w:t xml:space="preserve">  "traffic_light": {</w:t>
         <w:br/>
@@ -46399,7 +46407,9 @@
         <w:br/>
         <w:t xml:space="preserve">    "red": 0</w:t>
         <w:br/>
-        <w:t xml:space="preserve">  }</w:t>
+        <w:t xml:space="preserve">  },</w:t>
+        <w:br/>
+        <w:t xml:space="preserve">  "traffic_light_cuts": null</w:t>
         <w:br/>
         <w:t>}</w:t>
       </w:r>

</xml_diff>